<commit_message>
Modified file errors i caused.md wrote own defination
</commit_message>
<xml_diff>
--- a/Day00-Setup/Errors i caused.md.docx
+++ b/Day00-Setup/Errors i caused.md.docx
@@ -17,6 +17,52 @@
     <w:p>
       <w:pPr>
         <w:pStyle w:val="ListParagraph"/>
+        <w:ind w:left="405"/>
+      </w:pPr>
+      <w:r>
+        <w:t xml:space="preserve">Own words definition = we can not use int in a place of </w:t>
+      </w:r>
+      <w:proofErr w:type="gramStart"/>
+      <w:r>
+        <w:t>string ,</w:t>
+      </w:r>
+      <w:proofErr w:type="gramEnd"/>
+      <w:r>
+        <w:t xml:space="preserve"> </w:t>
+      </w:r>
+      <w:proofErr w:type="gramStart"/>
+      <w:r>
+        <w:t>S</w:t>
+      </w:r>
+      <w:r>
+        <w:t>o</w:t>
+      </w:r>
+      <w:proofErr w:type="gramEnd"/>
+      <w:r>
+        <w:t xml:space="preserve"> if </w:t>
+      </w:r>
+      <w:proofErr w:type="spellStart"/>
+      <w:r>
+        <w:t>i</w:t>
+      </w:r>
+      <w:proofErr w:type="spellEnd"/>
+      <w:r>
+        <w:t xml:space="preserve"> need int i need to mention </w:t>
+      </w:r>
+      <w:proofErr w:type="spellStart"/>
+      <w:proofErr w:type="gramStart"/>
+      <w:r>
+        <w:t>int.parse</w:t>
+      </w:r>
+      <w:proofErr w:type="spellEnd"/>
+      <w:proofErr w:type="gramEnd"/>
+      <w:r>
+        <w:t>.</w:t>
+      </w:r>
+    </w:p>
+    <w:p>
+      <w:pPr>
+        <w:pStyle w:val="ListParagraph"/>
         <w:numPr>
           <w:ilvl w:val="0"/>
           <w:numId w:val="1"/>
@@ -24,6 +70,26 @@
       </w:pPr>
       <w:r>
         <w:t>; expected</w:t>
+      </w:r>
+      <w:r>
+        <w:t xml:space="preserve"> </w:t>
+      </w:r>
+    </w:p>
+    <w:p>
+      <w:pPr>
+        <w:pStyle w:val="ListParagraph"/>
+        <w:ind w:left="405"/>
+      </w:pPr>
+      <w:r>
+        <w:t xml:space="preserve">Own words definition = we </w:t>
+      </w:r>
+      <w:proofErr w:type="gramStart"/>
+      <w:r>
+        <w:t>have to</w:t>
+      </w:r>
+      <w:proofErr w:type="gramEnd"/>
+      <w:r>
+        <w:t xml:space="preserve"> use semicolon at the end of statement.</w:t>
       </w:r>
     </w:p>
     <w:p>
@@ -742,7 +808,6 @@
   <w:style w:type="character" w:default="1" w:styleId="DefaultParagraphFont">
     <w:name w:val="Default Paragraph Font"/>
     <w:uiPriority w:val="1"/>
-    <w:semiHidden/>
     <w:unhideWhenUsed/>
   </w:style>
   <w:style w:type="table" w:default="1" w:styleId="TableNormal">

</xml_diff>

<commit_message>
Modified errors i caused file
</commit_message>
<xml_diff>
--- a/Day00-Setup/Errors i caused.md.docx
+++ b/Day00-Setup/Errors i caused.md.docx
@@ -47,7 +47,26 @@
       </w:r>
       <w:proofErr w:type="spellEnd"/>
       <w:r>
-        <w:t xml:space="preserve"> need int i need to mention </w:t>
+        <w:t xml:space="preserve"> need </w:t>
+      </w:r>
+      <w:proofErr w:type="gramStart"/>
+      <w:r>
+        <w:t>int</w:t>
+      </w:r>
+      <w:r>
+        <w:t xml:space="preserve"> ,</w:t>
+      </w:r>
+      <w:proofErr w:type="gramEnd"/>
+      <w:r>
+        <w:t xml:space="preserve"> </w:t>
+      </w:r>
+      <w:proofErr w:type="spellStart"/>
+      <w:r>
+        <w:t>i</w:t>
+      </w:r>
+      <w:proofErr w:type="spellEnd"/>
+      <w:r>
+        <w:t xml:space="preserve"> need to mention </w:t>
       </w:r>
       <w:proofErr w:type="spellStart"/>
       <w:proofErr w:type="gramStart"/>

</xml_diff>